<commit_message>
Deterministic release fixtures: fixed zip/core/comment timestamps
</commit_message>
<xml_diff>
--- a/corpus/release/comments.docx
+++ b/corpus/release/comments.docx
@@ -53,7 +53,7 @@
 
 <file path=word/comments.xml><?xml version="1.0" encoding="utf-8"?>
 <w:comments xmlns:a="http://schemas.openxmlformats.org/drawingml/2006/main" xmlns:pic="http://schemas.openxmlformats.org/drawingml/2006/picture" xmlns:r="http://schemas.openxmlformats.org/officeDocument/2006/relationships" xmlns:w="http://schemas.openxmlformats.org/wordprocessingml/2006/main" xmlns:wp="http://schemas.openxmlformats.org/drawingml/2006/wordprocessingDrawing" xmlns:mc="http://schemas.openxmlformats.org/markup-compatibility/2006" xmlns:a14="http://schemas.microsoft.com/office/drawing/2010/main" xmlns:w14="http://schemas.microsoft.com/office/word/2010/wordml" xmlns:wpc="http://schemas.microsoft.com/office/word/2010/wordprocessingCanvas">
-  <w:comment w:id="0" w:author="审稿人" w:initials="" w:date="2026-08-08T03:13:26Z">
+  <w:comment w:id="0" w:author="审稿人" w:initials="" w:date="2026-08-08T00:00:00Z">
     <w:p>
       <w:pPr>
         <w:pStyle w:val="CommentText"/>
@@ -69,7 +69,7 @@
       </w:r>
     </w:p>
   </w:comment>
-  <w:comment w:id="1" w:author="审稿人" w:initials="" w:date="2026-08-08T03:13:26Z">
+  <w:comment w:id="1" w:author="审稿人" w:initials="" w:date="2026-08-08T00:00:00Z">
     <w:p>
       <w:pPr>
         <w:pStyle w:val="CommentText"/>
@@ -85,7 +85,7 @@
       </w:r>
     </w:p>
   </w:comment>
-  <w:comment w:id="2" w:author="审稿人" w:initials="" w:date="2026-08-08T03:13:26Z">
+  <w:comment w:id="2" w:author="审稿人" w:initials="" w:date="2026-08-08T00:00:00Z">
     <w:p>
       <w:pPr>
         <w:pStyle w:val="CommentText"/>

</xml_diff>